<commit_message>
Update COVID-19 Pandemic Management Policy to match current practice
Replaces the 2020 pandemic-emergency protocols (mandatory masks,
7-day close-contact exclusion, entry restrictions, cashless-only
payment) with the lighter-touch approach actually followed now:
stay home when unwell, general hygiene, sanitiser and masks available
on request, no mandatory distancing or exclusion periods.
</commit_message>
<xml_diff>
--- a/server/templates/library/covid-19-pandemic-management-policy/template.docx
+++ b/server/templates/library/covid-19-pandemic-management-policy/template.docx
@@ -1756,7 +1756,7 @@
         <w:rPr>
           <w:rtl w:val="0"/>
         </w:rPr>
-        <w:t xml:space="preserve">Masks and alcohol-based hand sanitiser will be provided for use by all workers. </w:t>
+        <w:t xml:space="preserve">Alcohol-based hand sanitiser is available for use by all workers. Masks are available on request and are not required for routine service delivery. </w:t>
       </w:r>
     </w:p>
     <w:p>
@@ -1885,7 +1885,7 @@
         <w:rPr>
           <w:rtl w:val="0"/>
         </w:rPr>
-        <w:t xml:space="preserve">Only essential workers, clients and their Representative will be permitted entry to any Workplace. </w:t>
+        <w:t xml:space="preserve">There are no COVID-specific entry restrictions on Workplaces; general good hygiene and staying home when unwell applies to everyone. </w:t>
       </w:r>
     </w:p>
     <w:p>
@@ -1936,7 +1936,7 @@
         <w:rPr>
           <w:rtl w:val="0"/>
         </w:rPr>
-        <w:t>Any person who is considered a close contact of someone who has a positive diagnosis must not visit a clients’ house or have any face to face contact with a Client of {org.name} for at least 7 days.</w:t>
+        <w:t>There is no mandatory exclusion period for being a close contact of a COVID-19 case; general hygiene precautions and staying home if unwell apply.</w:t>
       </w:r>
     </w:p>
     <w:p>
@@ -1956,7 +1956,7 @@
         <w:rPr>
           <w:rtl w:val="0"/>
         </w:rPr>
-        <w:t xml:space="preserve">If you are a close contact with no symptoms, you should not enter other high-risk settings including disability and mental health and aged care residential facilities and healthcare settings, for 7 days after becoming a close contact.</w:t>
+        <w:t xml:space="preserve">If you have no symptoms, you may continue to attend Workplaces and provide supports as normal.</w:t>
       </w:r>
     </w:p>
     <w:p>
@@ -1976,7 +1976,7 @@
         <w:rPr>
           <w:rtl w:val="0"/>
         </w:rPr>
-        <w:t>If you are a close contact with symptoms, test for COVID-19 as soon as possible and you should not work in or visit {org.name}’s premises or our clients’ homes, including other high-risk settings for 7 days after becoming a close contact and until your symptoms have resolved and you return a negative test.</w:t>
+        <w:t>If you develop symptoms of COVID-19 or another contagious illness, seek testing or medical advice as appropriate and do not attend a Workplace or client visit until you are well and no longer considered infectious.</w:t>
       </w:r>
     </w:p>
     <w:p>
@@ -1993,7 +1993,7 @@
         <w:rPr>
           <w:rtl w:val="0"/>
         </w:rPr>
-        <w:t>It is recommended that household members of a person who has a confirmed case (including children) of COVID-19, be isolated from {org.name} workers.</w:t>
+        <w:t>Household members of a person with a confirmed case of COVID-19 are not required to isolate from {org.name} workers, provided they are not themselves unwell.</w:t>
       </w:r>
     </w:p>
     <w:p>
@@ -2010,7 +2010,7 @@
         <w:rPr>
           <w:rtl w:val="0"/>
         </w:rPr>
-        <w:t xml:space="preserve">Families must immediately advise {org.name} if they, or anyone in their family, develops any symptoms of the virus or receives a positive result of the virus whilst in close contact with a Client of {org.name}. </w:t>
+        <w:t xml:space="preserve">Families are encouraged to let {org.name} know if they, or anyone in their household, are unwell with a contagious illness around the time of a scheduled visit, so alternative arrangements can be made if needed. </w:t>
       </w:r>
     </w:p>
     <w:p>
@@ -2029,7 +2029,7 @@
         <w:rPr>
           <w:rtl w:val="0"/>
         </w:rPr>
-        <w:t>Any person (employee, enrolled child, parent, caregiver, visitor or contractor) who is displaying symptoms such as: fever, coughing, sore throat, fatigue and shortness of breath, must seek urgent medical attention to determine if they need to be tested for COVID-19 and not attend any support or service consultation with {org.name} under any circumstance.</w:t>
+        <w:t>Any person displaying symptoms of a contagious illness (such as fever, coughing, sore throat, fatigue or shortness of breath) should stay home and not attend a support or service consultation with {org.name} until they are well.</w:t>
       </w:r>
     </w:p>
     <w:p>
@@ -2166,7 +2166,7 @@
         <w:rPr>
           <w:rtl w:val="0"/>
         </w:rPr>
-        <w:t xml:space="preserve">Masks and alcohol based hand sanitiser are provided to all workers.</w:t>
+        <w:t xml:space="preserve">Alcohol-based hand sanitiser is provided to all workers, with masks available on request.</w:t>
       </w:r>
     </w:p>
     <w:p>
@@ -2184,7 +2184,7 @@
         <w:rPr>
           <w:rtl w:val="0"/>
         </w:rPr>
-        <w:t>{org.name} prohibits close contact with anyone with a positive COVID-19 in the past 14 days;</w:t>
+        <w:t>Workers and Clients who are unwell are asked to stay home until well, consistent with general hygiene practice;</w:t>
       </w:r>
     </w:p>
     <w:p>
@@ -2220,7 +2220,7 @@
         <w:rPr>
           <w:rtl w:val="0"/>
         </w:rPr>
-        <w:t>Physical / social distancing and maintaining 1.5m distance from other people at a minimum and spacing furniture clients and workers use accordingly.</w:t>
+        <w:t>General hygiene practices such as handwashing and regular cleaning of shared surfaces and equipment, without mandatory physical distancing requirements.</w:t>
       </w:r>
     </w:p>
     <w:p>
@@ -2256,7 +2256,7 @@
         <w:rPr>
           <w:rtl w:val="0"/>
         </w:rPr>
-        <w:t>Invoicing clients for services rendered and encouraging payment via online bank transfer, rather than taking payment from clients directly.</w:t>
+        <w:t>Standard invoicing and payment practices as set out in the Client’s Service Agreement.</w:t>
       </w:r>
     </w:p>
     <w:p>

</xml_diff>